<commit_message>
Update Copy Deck with latest website changes
Homepage Services:
- Service 01: Updated body copy for The AI Build
- Service 02: Updated tagline and body for AI Strategy Session

Services Page:
- Updated hero headline: "Turn your business knowledge into AI workflows you can use"
- Updated meta description to reflect founder-led service firm focus
- Comprehensive new layout with 4 sections under The AI Build
- Updated AI Strategy Session section

Co-Authored-By: Claude Haiku 4.5 <noreply@anthropic.com>
</commit_message>
<xml_diff>
--- a/Reve_AI_Copy_Deck.docx
+++ b/Reve_AI_Copy_Deck.docx
@@ -274,7 +274,7 @@
         <w:spacing w:after="200"/>
       </w:pPr>
       <w:r>
-        <w:t xml:space="preserve">Two ways to work together.</w:t>
+        <w:t xml:space="preserve">Turn your business knowledge into AI workflows you can use.</w:t>
       </w:r>
     </w:p>
     <w:p>
@@ -949,7 +949,7 @@
         <w:spacing w:after="120"/>
       </w:pPr>
       <w:r>
-        <w:t xml:space="preserve">Two ways to work together.</w:t>
+        <w:t xml:space="preserve">Turn your business knowledge into AI workflows you can use.</w:t>
       </w:r>
     </w:p>
     <w:p>

</xml_diff>